<commit_message>
add: implement database triggers and functions for search vector maintenance and automatic updated_at
</commit_message>
<xml_diff>
--- a/docs/new-ideas.docx
+++ b/docs/new-ideas.docx
@@ -11,9 +11,19 @@
           <w:u w:val="single"/>
         </w:rPr>
       </w:pPr>
-      <w:r>
+    </w:p>
+    <w:p>
+      <w:pPr>
+        <w:jc w:val="center"/>
         <w:rPr>
-          <w:rFonts w:ascii="Calibri" w:hAnsi="Calibri" w:eastAsia="Calibri" w:cs="Calibri" w:asciiTheme="minorHAnsi" w:hAnsiTheme="minorHAnsi" w:eastAsiaTheme="minorHAnsi" w:csTheme="minorBidi"/>
+          <w:sz w:val="36"/>
+          <w:szCs w:val="36"/>
+          <w:u w:val="single"/>
+        </w:rPr>
+      </w:pPr>
+      <w:r>
+        <w:rPr>
+          <w:rFonts w:ascii="Calibri" w:hAnsi="Calibri" w:eastAsia="Calibri" w:cs="Calibri" w:asciiTheme="minorHAnsi" w:hAnsiTheme="minorHAnsi" w:eastAsiaTheme="minorHAnsi"/>
           <w:kern w:val="2"/>
           <w:sz w:val="36"/>
           <w:szCs w:val="36"/>
@@ -33,7 +43,7 @@
     <w:p>
       <w:r>
         <w:rPr>
-          <w:rFonts w:ascii="Calibri" w:hAnsi="Calibri" w:eastAsia="Calibri" w:cs="Calibri" w:asciiTheme="minorHAnsi" w:hAnsiTheme="minorHAnsi" w:eastAsiaTheme="minorHAnsi" w:csTheme="minorBidi"/>
+          <w:rFonts w:ascii="Calibri" w:hAnsi="Calibri" w:eastAsia="Calibri" w:cs="Calibri" w:asciiTheme="minorHAnsi" w:hAnsiTheme="minorHAnsi" w:eastAsiaTheme="minorHAnsi"/>
           <w:kern w:val="2"/>
           <w:sz w:val="24"/>
           <w:szCs w:val="24"/>
@@ -44,7 +54,7 @@
         <w:r>
           <w:rPr>
             <w:rStyle w:val="Hyperlink"/>
-            <w:rFonts w:ascii="Calibri" w:hAnsi="Calibri" w:eastAsia="Calibri" w:cs="Calibri" w:asciiTheme="minorHAnsi" w:hAnsiTheme="minorHAnsi" w:eastAsiaTheme="minorHAnsi" w:csTheme="minorBidi"/>
+            <w:rFonts w:ascii="Calibri" w:hAnsi="Calibri" w:eastAsia="Calibri" w:cs="Calibri" w:asciiTheme="minorHAnsi" w:hAnsiTheme="minorHAnsi" w:eastAsiaTheme="minorHAnsi"/>
             <w:color w:val="0563C1" w:themeColor="hyperlink"/>
             <w:kern w:val="2"/>
             <w:sz w:val="24"/>
@@ -56,7 +66,7 @@
       </w:hyperlink>
       <w:r>
         <w:rPr>
-          <w:rFonts w:ascii="Calibri" w:hAnsi="Calibri" w:eastAsia="Calibri" w:cs="Calibri" w:asciiTheme="minorHAnsi" w:hAnsiTheme="minorHAnsi" w:eastAsiaTheme="minorHAnsi" w:csTheme="minorBidi"/>
+          <w:rFonts w:ascii="Calibri" w:hAnsi="Calibri" w:eastAsia="Calibri" w:cs="Calibri" w:asciiTheme="minorHAnsi" w:hAnsiTheme="minorHAnsi" w:eastAsiaTheme="minorHAnsi"/>
           <w:kern w:val="2"/>
           <w:sz w:val="24"/>
           <w:szCs w:val="24"/>
@@ -68,7 +78,7 @@
     <w:p>
       <w:r>
         <w:rPr>
-          <w:rFonts w:ascii="Calibri" w:hAnsi="Calibri" w:eastAsia="Calibri" w:cs="Calibri" w:asciiTheme="minorHAnsi" w:hAnsiTheme="minorHAnsi" w:eastAsiaTheme="minorHAnsi" w:csTheme="minorBidi"/>
+          <w:rFonts w:ascii="Calibri" w:hAnsi="Calibri" w:eastAsia="Calibri" w:cs="Calibri" w:asciiTheme="minorHAnsi" w:hAnsiTheme="minorHAnsi" w:eastAsiaTheme="minorHAnsi"/>
           <w:kern w:val="2"/>
           <w:sz w:val="24"/>
           <w:szCs w:val="24"/>
@@ -80,7 +90,7 @@
       </w:r>
       <w:r>
         <w:rPr>
-          <w:rFonts w:ascii="Calibri" w:hAnsi="Calibri" w:eastAsia="Calibri" w:cs="Calibri" w:asciiTheme="minorHAnsi" w:hAnsiTheme="minorHAnsi" w:eastAsiaTheme="minorHAnsi" w:csTheme="minorBidi"/>
+          <w:rFonts w:ascii="Calibri" w:hAnsi="Calibri" w:eastAsia="Calibri" w:cs="Calibri" w:asciiTheme="minorHAnsi" w:hAnsiTheme="minorHAnsi" w:eastAsiaTheme="minorHAnsi"/>
           <w:kern w:val="2"/>
           <w:sz w:val="24"/>
           <w:szCs w:val="24"/>
@@ -92,7 +102,7 @@
       </w:r>
       <w:r>
         <w:rPr>
-          <w:rFonts w:ascii="Calibri" w:hAnsi="Calibri" w:eastAsia="Calibri" w:cs="Calibri" w:asciiTheme="minorHAnsi" w:hAnsiTheme="minorHAnsi" w:eastAsiaTheme="minorHAnsi" w:csTheme="minorBidi"/>
+          <w:rFonts w:ascii="Calibri" w:hAnsi="Calibri" w:eastAsia="Calibri" w:cs="Calibri" w:asciiTheme="minorHAnsi" w:hAnsiTheme="minorHAnsi" w:eastAsiaTheme="minorHAnsi"/>
           <w:kern w:val="2"/>
           <w:sz w:val="24"/>
           <w:szCs w:val="24"/>
@@ -104,7 +114,7 @@
       </w:r>
       <w:r>
         <w:rPr>
-          <w:rFonts w:ascii="Calibri" w:hAnsi="Calibri" w:eastAsia="Calibri" w:cs="Calibri" w:asciiTheme="minorHAnsi" w:hAnsiTheme="minorHAnsi" w:eastAsiaTheme="minorHAnsi" w:csTheme="minorBidi"/>
+          <w:rFonts w:ascii="Calibri" w:hAnsi="Calibri" w:eastAsia="Calibri" w:cs="Calibri" w:asciiTheme="minorHAnsi" w:hAnsiTheme="minorHAnsi" w:eastAsiaTheme="minorHAnsi"/>
           <w:kern w:val="2"/>
           <w:sz w:val="24"/>
           <w:szCs w:val="24"/>
@@ -113,6 +123,11 @@
       </w:r>
     </w:p>
     <w:p/>
+    <w:p>
+      <w:r>
+        <w:t>Afficher la disponibilité d'un bien par periode (par exemple, disponible dans un mois)</w:t>
+      </w:r>
+    </w:p>
     <w:sectPr>
       <w:pgSz w:w="12240" w:h="15840"/>
       <w:pgMar w:top="1440" w:right="1440" w:bottom="1440" w:left="1440" w:header="708" w:footer="708" w:gutter="0"/>

</xml_diff>

<commit_message>
chore(docs): update new ideas document with latest changes
</commit_message>
<xml_diff>
--- a/docs/new-ideas.docx
+++ b/docs/new-ideas.docx
@@ -5,25 +5,15 @@
     <w:p>
       <w:pPr>
         <w:jc w:val="center"/>
-        <w:rPr>
-          <w:sz w:val="36"/>
-          <w:szCs w:val="36"/>
-          <w:u w:val="single"/>
-        </w:rPr>
       </w:pPr>
     </w:p>
     <w:p>
       <w:pPr>
         <w:jc w:val="center"/>
+      </w:pPr>
+      <w:r>
         <w:rPr>
-          <w:sz w:val="36"/>
-          <w:szCs w:val="36"/>
-          <w:u w:val="single"/>
-        </w:rPr>
-      </w:pPr>
-      <w:r>
-        <w:rPr>
-          <w:rFonts w:ascii="Calibri" w:hAnsi="Calibri" w:eastAsia="Calibri" w:cs="Calibri" w:asciiTheme="minorHAnsi" w:hAnsiTheme="minorHAnsi" w:eastAsiaTheme="minorHAnsi"/>
+          <w:rFonts w:ascii="Calibri" w:cs="Calibri"/>
           <w:kern w:val="2"/>
           <w:sz w:val="36"/>
           <w:szCs w:val="36"/>
@@ -32,30 +22,22 @@
         <w:t>Nouvelles Idées Pour l’Application</w:t>
       </w:r>
     </w:p>
-    <w:p>
-      <w:pPr>
+    <w:p/>
+    <w:p>
+      <w:r>
         <w:rPr>
-          <w:sz w:val="36"/>
-          <w:szCs w:val="36"/>
-        </w:rPr>
-      </w:pPr>
-    </w:p>
-    <w:p>
-      <w:r>
-        <w:rPr>
-          <w:rFonts w:ascii="Calibri" w:hAnsi="Calibri" w:eastAsia="Calibri" w:cs="Calibri" w:asciiTheme="minorHAnsi" w:hAnsiTheme="minorHAnsi" w:eastAsiaTheme="minorHAnsi"/>
+          <w:rFonts w:ascii="Calibri" w:cs="Calibri"/>
           <w:kern w:val="2"/>
           <w:sz w:val="24"/>
           <w:szCs w:val="24"/>
         </w:rPr>
-        <w:t xml:space="preserve">Ajouter les options de customisation pour un proprietaire : un propriétaire peux par exemple décrire ce qu’il y à l’intérieur de sa maison (au cas où c’est un meublé) comme télé, frigo, ustensiles de cuisine… (à l’example de </w:t>
+        <w:t xml:space="preserve">- Ajouter les options de customisation pour un proprietaire : un propriétaire peux par exemple décrire ce qu’il y à l’intérieur de sa maison (au cas où c’est un meublé) comme télé, frigo, ustensiles de cuisine… (à l’example de </w:t>
       </w:r>
       <w:hyperlink r:id="rId6">
         <w:r>
           <w:rPr>
             <w:rStyle w:val="Hyperlink"/>
-            <w:rFonts w:ascii="Calibri" w:hAnsi="Calibri" w:eastAsia="Calibri" w:cs="Calibri" w:asciiTheme="minorHAnsi" w:hAnsiTheme="minorHAnsi" w:eastAsiaTheme="minorHAnsi"/>
-            <w:color w:val="0563C1" w:themeColor="hyperlink"/>
+            <w:rFonts w:ascii="Calibri" w:cs="Calibri"/>
             <w:kern w:val="2"/>
             <w:sz w:val="24"/>
             <w:szCs w:val="24"/>
@@ -66,7 +48,7 @@
       </w:hyperlink>
       <w:r>
         <w:rPr>
-          <w:rFonts w:ascii="Calibri" w:hAnsi="Calibri" w:eastAsia="Calibri" w:cs="Calibri" w:asciiTheme="minorHAnsi" w:hAnsiTheme="minorHAnsi" w:eastAsiaTheme="minorHAnsi"/>
+          <w:rFonts w:ascii="Calibri" w:cs="Calibri"/>
           <w:kern w:val="2"/>
           <w:sz w:val="24"/>
           <w:szCs w:val="24"/>
@@ -78,19 +60,19 @@
     <w:p>
       <w:r>
         <w:rPr>
-          <w:rFonts w:ascii="Calibri" w:hAnsi="Calibri" w:eastAsia="Calibri" w:cs="Calibri" w:asciiTheme="minorHAnsi" w:hAnsiTheme="minorHAnsi" w:eastAsiaTheme="minorHAnsi"/>
+          <w:rFonts w:ascii="Calibri" w:cs="Calibri"/>
           <w:kern w:val="2"/>
           <w:sz w:val="24"/>
           <w:szCs w:val="24"/>
         </w:rPr>
-        <w:t>Ajouter un bouton « Partager » pour partager le lien d’un bien trouver à un autre utilisateur (accessible si utilisateur ayant un compte)</w:t>
+        <w:t>- Ajouter un bouton « Partager » pour partager le lien d’un bien trouver à un autre utilisateur (accessible si utilisateur ayant un compte)</w:t>
       </w:r>
       <w:r>
         <w:br w:type="textWrapping"/>
       </w:r>
       <w:r>
         <w:rPr>
-          <w:rFonts w:ascii="Calibri" w:hAnsi="Calibri" w:eastAsia="Calibri" w:cs="Calibri" w:asciiTheme="minorHAnsi" w:hAnsiTheme="minorHAnsi" w:eastAsiaTheme="minorHAnsi"/>
+          <w:rFonts w:ascii="Calibri" w:cs="Calibri"/>
           <w:kern w:val="2"/>
           <w:sz w:val="24"/>
           <w:szCs w:val="24"/>
@@ -102,30 +84,40 @@
       </w:r>
       <w:r>
         <w:rPr>
-          <w:rFonts w:ascii="Calibri" w:hAnsi="Calibri" w:eastAsia="Calibri" w:cs="Calibri" w:asciiTheme="minorHAnsi" w:hAnsiTheme="minorHAnsi" w:eastAsiaTheme="minorHAnsi"/>
+          <w:rFonts w:ascii="Calibri" w:cs="Calibri"/>
           <w:kern w:val="2"/>
           <w:sz w:val="24"/>
           <w:szCs w:val="24"/>
         </w:rPr>
-        <w:t xml:space="preserve">Un propriétaire peut ajouter </w:t>
-      </w:r>
-      <w:r>
-        <w:tab/>
-      </w:r>
+        <w:t>- Un propriétaire peut ajouter des règlements definie pour ces locataier ( pas d’animeaux, non-fumeur, uniquement aux étudiant… payement mansuel, trimestriel, annuel )</w:t>
+      </w:r>
+    </w:p>
+    <w:p/>
+    <w:p>
       <w:r>
         <w:rPr>
-          <w:rFonts w:ascii="Calibri" w:hAnsi="Calibri" w:eastAsia="Calibri" w:cs="Calibri" w:asciiTheme="minorHAnsi" w:hAnsiTheme="minorHAnsi" w:eastAsiaTheme="minorHAnsi"/>
+          <w:rFonts w:ascii="Calibri" w:cs="Calibri"/>
           <w:kern w:val="2"/>
           <w:sz w:val="24"/>
           <w:szCs w:val="24"/>
         </w:rPr>
-        <w:t>des règlements definie pour ces locataier ( pas d’animeaux, non-fumeur, uniquement aux étudiant… payement mansuel, trimestriel, annuel )</w:t>
+        <w:t>- Afficher la disponibilité d'un bien par periode (par exemple, disponible dans un mois)</w:t>
       </w:r>
     </w:p>
     <w:p/>
     <w:p>
       <w:r>
-        <w:t>Afficher la disponibilité d'un bien par periode (par exemple, disponible dans un mois)</w:t>
+        <w:t>- envoyer un email de confirmation de update du profile utilisateurs, lorsqu'un utilisateurs essayer de mette à jour ses informations.</w:t>
+      </w:r>
+    </w:p>
+    <w:p>
+      <w:r>
+        <w:t>- Dashboard admin permettant d'administrer ses biens en location (nom et contrat du locataire)</w:t>
+      </w:r>
+    </w:p>
+    <w:p>
+      <w:r>
+        <w:t>- Ajouter l'option "à vendre", "à louer" respectivement pour les biens à vendre et à louer.</w:t>
       </w:r>
     </w:p>
     <w:sectPr>

</xml_diff>